<commit_message>
Rewrite Demand Charter content in plain, easy-to-understand language
- Replaces accounting/technical jargon (MPM, aggregation/disaggregation,
  gap assessment, IAS 1, non-GAAP, etc.) with everyday phrasing across
  the .md, .pptx, and .docx versions, while keeping the same
  structure, fields, and information.
- Adds plain-language section headings alongside the original field
  names (e.g. "What's the problem today? (Current Situation and Pain
  Points)").
- Regenerates the .pptx/.docx/preview.png from the updated generator
  scripts and re-verified all three open correctly (zip integrity +
  python-docx/python-pptx round-trip + LibreOffice render).

Co-authored-by: enikebaga <enikebaga@users.noreply.github.com>
</commit_message>
<xml_diff>
--- a/demand-charter/288-IFRS18-Demand-Charter.docx
+++ b/demand-charter/288-IFRS18-Demand-Charter.docx
@@ -16,7 +16,7 @@
     </w:p>
     <w:p>
       <w:r>
-        <w:t>Knowledge-base copy of the filled-in Demand Charter for demand 288 (IFRS 18 Implementation). See also the .md and .pptx versions in this folder; all three contain the same content.</w:t>
+        <w:t>Knowledge-base copy of the filled-in Demand Charter for demand 288 (IFRS 18 Implementation), written in plain, easy-to-understand language. See also the .md and .pptx versions in this folder; all three contain the same content.</w:t>
       </w:r>
     </w:p>
     <w:tbl>
@@ -167,7 +167,7 @@
                 <w:b w:val="0"/>
                 <w:sz w:val="20"/>
               </w:rPr>
-              <w:t>Finance – Accounting &amp; Financial Reporting (R2R)</w:t>
+              <w:t>Finance – Accounting &amp; Financial Reporting</w:t>
             </w:r>
           </w:p>
         </w:tc>
@@ -220,7 +220,20 @@
                 <w:color w:val="FFFFFF"/>
                 <w:sz w:val="20"/>
               </w:rPr>
-              <w:t>Current Situation and Pain Points</w:t>
+              <w:t>What's the problem today?</w:t>
+            </w:r>
+          </w:p>
+          <w:p>
+            <w:pPr>
+              <w:jc w:val="center"/>
+            </w:pPr>
+            <w:r>
+              <w:rPr>
+                <w:b/>
+                <w:color w:val="FFFFFF"/>
+                <w:sz w:val="20"/>
+              </w:rPr>
+              <w:t>(Current Situation and Pain Points)</w:t>
             </w:r>
           </w:p>
         </w:tc>
@@ -240,7 +253,20 @@
                 <w:color w:val="FFFFFF"/>
                 <w:sz w:val="20"/>
               </w:rPr>
-              <w:t>Business Objectives and High-Level Demand Description</w:t>
+              <w:t>What are we trying to achieve?</w:t>
+            </w:r>
+          </w:p>
+          <w:p>
+            <w:pPr>
+              <w:jc w:val="center"/>
+            </w:pPr>
+            <w:r>
+              <w:rPr>
+                <w:b/>
+                <w:color w:val="FFFFFF"/>
+                <w:sz w:val="20"/>
+              </w:rPr>
+              <w:t>(Business Objectives and High-Level Demand Description)</w:t>
             </w:r>
           </w:p>
         </w:tc>
@@ -258,7 +284,7 @@
               <w:rPr>
                 <w:sz w:val="19"/>
               </w:rPr>
-              <w:t>• IAS 1 today does not mandate P&amp;L categories/subtotals → inconsistent presentation across entities and limited peer comparability.</w:t>
+              <w:t>• No fixed structure today, so different teams present profit &amp; loss differently → hard to compare across the company or with peers.</w:t>
             </w:r>
           </w:p>
           <w:p>
@@ -267,7 +293,7 @@
               <w:rPr>
                 <w:sz w:val="19"/>
               </w:rPr>
-              <w:t>• No formal governance for management-defined performance measures (MPMs) used in investor communications → audit/compliance risk.</w:t>
+              <w:t>• No clear, approved process for our “adjusted” performance numbers shown to investors → risk once we must explain how they're calculated.</w:t>
             </w:r>
           </w:p>
           <w:p>
@@ -276,7 +302,7 @@
               <w:rPr>
                 <w:sz w:val="19"/>
               </w:rPr>
-              <w:t>• Chart of accounts and consolidation/reporting system not structured to auto-classify P&amp;L lines into operating / investing / financing.</w:t>
+              <w:t>• Our systems don't automatically sort P&amp;L items into the 3 new required groups: Operating, Investing, Financing.</w:t>
             </w:r>
           </w:p>
           <w:p>
@@ -285,7 +311,7 @@
               <w:rPr>
                 <w:sz w:val="19"/>
               </w:rPr>
-              <w:t>• Alternative performance measures produced via manual spreadsheets with limited audit trail.</w:t>
+              <w:t>• Adjusted performance numbers are built by hand in spreadsheets — slow, error-prone, and hard for auditors to check.</w:t>
             </w:r>
           </w:p>
           <w:p>
@@ -294,7 +320,7 @@
               <w:rPr>
                 <w:sz w:val="19"/>
               </w:rPr>
-              <w:t>• Inconsistent aggregation/disaggregation of line items across business units.</w:t>
+              <w:t>• Business units group similar costs differently; the new rule needs much more consistency here.</w:t>
             </w:r>
           </w:p>
           <w:p>
@@ -303,7 +329,7 @@
               <w:rPr>
                 <w:sz w:val="19"/>
               </w:rPr>
-              <w:t>• No dedicated budget/resourcing yet assigned for IFRS 18 readiness.</w:t>
+              <w:t>• No dedicated time or budget yet assigned to prepare for this change.</w:t>
             </w:r>
           </w:p>
           <w:p>
@@ -312,7 +338,7 @@
               <w:rPr>
                 <w:sz w:val="19"/>
               </w:rPr>
-              <w:t>• External auditors not yet formally engaged on transition approach or comparative restatement.</w:t>
+              <w:t>• We haven't yet talked to our external auditors about how we'll make this change or restate last year's numbers.</w:t>
             </w:r>
           </w:p>
         </w:tc>
@@ -328,7 +354,7 @@
               <w:rPr>
                 <w:sz w:val="19"/>
               </w:rPr>
-              <w:t>• Achieve full IFRS 18 compliance before the mandatory effective date (periods beginning ≥ 1 Jan 2027; comparatives from 1 Jan 2026).</w:t>
+              <w:t>• Be fully ready for IFRS 18 before it's mandatory (years starting on/after 1 Jan 2027; last year's figures restated from 1 Jan 2026).</w:t>
             </w:r>
           </w:p>
           <w:p>
@@ -337,7 +363,7 @@
               <w:rPr>
                 <w:sz w:val="19"/>
               </w:rPr>
-              <w:t>• Gap assessment of chart of accounts, consolidation system and disclosure templates vs. the 3 new categories &amp; 2 new subtotals.</w:t>
+              <w:t>• Check what needs to change in our chart of accounts, reporting system and templates for the 3 new groups &amp; 2 new required subtotals.</w:t>
             </w:r>
           </w:p>
           <w:p>
@@ -346,7 +372,7 @@
               <w:rPr>
                 <w:sz w:val="19"/>
               </w:rPr>
-              <w:t>• Define &amp; govern Management-Defined Performance Measures (MPMs), incl. required reconciliation disclosures.</w:t>
+              <w:t>• Set clear, approved rules for our “adjusted” performance numbers, incl. showing how they connect back to the official numbers.</w:t>
             </w:r>
           </w:p>
           <w:p>
@@ -355,7 +381,7 @@
               <w:rPr>
                 <w:sz w:val="19"/>
               </w:rPr>
-              <w:t>• Reconfigure P&amp;L structure, CoA mapping and consolidation tool for native category/subtotal reporting.</w:t>
+              <w:t>• Update our P&amp;L structure, account mapping and reporting system so the new groups/subtotals are produced automatically.</w:t>
             </w:r>
           </w:p>
           <w:p>
@@ -364,7 +390,7 @@
               <w:rPr>
                 <w:sz w:val="19"/>
               </w:rPr>
-              <w:t>• Update statutory templates, disclosure checklists and cash-flow reconciliation logic; train Finance/Controlling/IR.</w:t>
+              <w:t>• Update official templates, checklists and cash-flow statement; train Finance/Controlling/Investor Relations.</w:t>
             </w:r>
           </w:p>
           <w:p>
@@ -373,7 +399,7 @@
               <w:rPr>
                 <w:sz w:val="19"/>
               </w:rPr>
-              <w:t>• Run a parallel/dry-run reporting cycle and align with external auditors on the transition approach.</w:t>
+              <w:t>• Run a test/dry-run reporting cycle and work with our external auditors on how we make the change.</w:t>
             </w:r>
           </w:p>
         </w:tc>
@@ -514,7 +540,7 @@
               <w:rPr>
                 <w:sz w:val="19"/>
               </w:rPr>
-              <w:t>• Full compliance with mandatory standard; avoids audit qualification.</w:t>
+              <w:t>• We follow the new mandatory rule, avoiding audit and regulatory risk.</w:t>
             </w:r>
           </w:p>
           <w:p>
@@ -523,7 +549,7 @@
               <w:rPr>
                 <w:sz w:val="19"/>
               </w:rPr>
-              <w:t>• Improved comparability/transparency for investors via standardized subtotals.</w:t>
+              <w:t>• Our financial statements become easier to compare, for our teams and investors.</w:t>
             </w:r>
           </w:p>
           <w:p>
@@ -532,7 +558,7 @@
               <w:rPr>
                 <w:sz w:val="19"/>
               </w:rPr>
-              <w:t>• Stronger governance/audit trail over non-GAAP measures.</w:t>
+              <w:t>• Clearer, better-documented rules for our adjusted performance numbers.</w:t>
             </w:r>
           </w:p>
           <w:p>
@@ -541,7 +567,7 @@
               <w:rPr>
                 <w:sz w:val="19"/>
               </w:rPr>
-              <w:t>• Harmonized P&amp;L supports statutory &amp; management reporting.</w:t>
+              <w:t>• Simpler, more consistent P&amp;L for both official and internal reporting.</w:t>
             </w:r>
           </w:p>
           <w:p>
@@ -550,7 +576,7 @@
               <w:rPr>
                 <w:sz w:val="19"/>
               </w:rPr>
-              <w:t>• Reduced manual effort/error risk at close.</w:t>
+              <w:t>• Less manual work and fewer mistakes at closing time.</w:t>
             </w:r>
           </w:p>
         </w:tc>
@@ -566,7 +592,7 @@
               <w:rPr>
                 <w:sz w:val="19"/>
               </w:rPr>
-              <w:t>• Reduced manual closing/adjustment effort per cycle once automated (FTE-days TBD after design phase).</w:t>
+              <w:t>• Less manual work each closing cycle once the system sorts things automatically (exact savings TBD after detailed review).</w:t>
             </w:r>
           </w:p>
           <w:p>
@@ -575,7 +601,7 @@
               <w:rPr>
                 <w:sz w:val="19"/>
               </w:rPr>
-              <w:t>• Avoidance of one-off remediation costs (advisory, late changes, audit findings) from a rushed transition.</w:t>
+              <w:t>• We avoid extra costs (advisors, rushed fixes, audit findings) from leaving this until the last minute.</w:t>
             </w:r>
           </w:p>
           <w:p>
@@ -584,7 +610,7 @@
               <w:rPr>
                 <w:sz w:val="19"/>
               </w:rPr>
-              <w:t>• Precise figures to be confirmed after gap assessment.</w:t>
+              <w:t>• Exact figures to be confirmed after the initial review.</w:t>
             </w:r>
           </w:p>
         </w:tc>
@@ -627,7 +653,7 @@
               <w:rPr>
                 <w:sz w:val="19"/>
               </w:rPr>
-              <w:t>• Consolidation &amp; Reporting Systems / IT</w:t>
+              <w:t>• IT / Reporting Systems team</w:t>
             </w:r>
           </w:p>
           <w:p>
@@ -645,7 +671,7 @@
               <w:rPr>
                 <w:sz w:val="19"/>
               </w:rPr>
-              <w:t>• Business Unit Controllers</w:t>
+              <w:t>• Local Finance teams (Business Units)</w:t>
             </w:r>
           </w:p>
           <w:p>
@@ -654,7 +680,7 @@
               <w:rPr>
                 <w:sz w:val="19"/>
               </w:rPr>
-              <w:t>• Company Secretary / Legal (if applicable)</w:t>
+              <w:t>• Legal / Company Secretary (if applicable)</w:t>
             </w:r>
           </w:p>
         </w:tc>
@@ -679,7 +705,7 @@
                 <w:b w:val="0"/>
                 <w:sz w:val="19"/>
               </w:rPr>
-              <w:t>~40 PD (illustrative; IT/consolidation system config, CoA mapping, reports)</w:t>
+              <w:t>~40 person-days (rough estimate; updating IT systems, accounts, reports)</w:t>
             </w:r>
           </w:p>
           <w:p>
@@ -705,7 +731,7 @@
                 <w:b w:val="0"/>
                 <w:sz w:val="19"/>
               </w:rPr>
-              <w:t>~25 PD (illustrative; gap assessment, MPM governance, policy, training)</w:t>
+              <w:t>~25 person-days (rough estimate; reviewing changes, setting rules, training)</w:t>
             </w:r>
           </w:p>
         </w:tc>

</xml_diff>